<commit_message>
Se corrige el caso de uso de reportería con el desarrollo
</commit_message>
<xml_diff>
--- a/Casos de Uso/CU-13-Reporteria.docx
+++ b/Casos de Uso/CU-13-Reporteria.docx
@@ -47,7 +47,7 @@
           <w:szCs w:val="36"/>
           <w:lang w:val="es-ES"/>
         </w:rPr>
-        <w:t xml:space="preserve">CU-13-Reportería</w:t>
+        <w:t>CU-13-Reportería</w:t>
       </w:r>
     </w:p>
     <w:p>
@@ -61,7 +61,7 @@
         <w:rPr>
           <w:lang w:val="es-ES"/>
         </w:rPr>
-        <w:t xml:space="preserve">Versión 1.0</w:t>
+        <w:t>Versión 1.0</w:t>
       </w:r>
     </w:p>
     <w:p>
@@ -75,7 +75,7 @@
         <w:rPr>
           <w:lang w:val="es-ES"/>
         </w:rPr>
-        <w:t xml:space="preserve">Elaborado por grupo 1 Análisis de Sistemas</w:t>
+        <w:t>Elaborado por grupo 1 Análisis de Sistemas</w:t>
       </w:r>
     </w:p>
     <w:p>
@@ -91,7 +91,7 @@
           <w:noProof/>
           <w:lang w:val="es-GT"/>
         </w:rPr>
-        <w:t xml:space="preserve">Fecha Elaboración 14/07/2026</w:t>
+        <w:t>Fecha Elaboración 14/07/2026</w:t>
       </w:r>
     </w:p>
     <w:p>
@@ -296,7 +296,7 @@
                 <w:noProof/>
                 <w:lang w:val="es-GT"/>
               </w:rPr>
-              <w:t xml:space="preserve">grupo 1 Análisis de Sistemas 2</w:t>
+              <w:t>grupo 1 Análisis de Sistemas 2</w:t>
             </w:r>
           </w:p>
         </w:tc>
@@ -321,7 +321,7 @@
                 <w:noProof/>
                 <w:lang w:val="es-GT"/>
               </w:rPr>
-              <w:t xml:space="preserve">06/10/2026</w:t>
+              <w:t>06/10/2026</w:t>
             </w:r>
           </w:p>
         </w:tc>
@@ -346,7 +346,7 @@
                 <w:noProof/>
                 <w:lang w:val="es-GT"/>
               </w:rPr>
-              <w:t xml:space="preserve">Creación del documento</w:t>
+              <w:t>Creación del documento</w:t>
             </w:r>
           </w:p>
         </w:tc>
@@ -372,7 +372,7 @@
                 <w:noProof/>
                 <w:lang w:val="es-GT"/>
               </w:rPr>
-              <w:t xml:space="preserve">1.0</w:t>
+              <w:t>1.0</w:t>
             </w:r>
           </w:p>
         </w:tc>
@@ -400,7 +400,7 @@
                 <w:noProof/>
                 <w:lang w:val="es-GT"/>
               </w:rPr>
-              <w:t xml:space="preserve">grupo 1 Análisis de Sistemas 2</w:t>
+              <w:t>grupo 1 Análisis de Sistemas 2</w:t>
             </w:r>
           </w:p>
         </w:tc>
@@ -425,7 +425,7 @@
                 <w:noProof/>
                 <w:lang w:val="es-GT"/>
               </w:rPr>
-              <w:t xml:space="preserve">13/10/2026</w:t>
+              <w:t>13/10/2026</w:t>
             </w:r>
           </w:p>
         </w:tc>
@@ -450,7 +450,7 @@
                 <w:noProof/>
                 <w:lang w:val="es-GT"/>
               </w:rPr>
-              <w:t xml:space="preserve">Actualización de las referencias a los casos de uso renumerados</w:t>
+              <w:t>Actualización de las referencias a los casos de uso renumerados</w:t>
             </w:r>
           </w:p>
         </w:tc>
@@ -476,7 +476,7 @@
                 <w:noProof/>
                 <w:lang w:val="es-GT"/>
               </w:rPr>
-              <w:t xml:space="preserve">1.0</w:t>
+              <w:t>1.0</w:t>
             </w:r>
           </w:p>
         </w:tc>
@@ -505,7 +505,7 @@
                 <w:noProof/>
                 <w:lang w:val="es-GT"/>
               </w:rPr>
-              <w:t xml:space="preserve">grupo 1 Análisis de Sistemas 2</w:t>
+              <w:t>grupo 1 Análisis de Sistemas 2</w:t>
             </w:r>
           </w:p>
         </w:tc>
@@ -532,7 +532,7 @@
                 <w:noProof/>
                 <w:lang w:val="es-GT"/>
               </w:rPr>
-              <w:t xml:space="preserve">13/10/2026</w:t>
+              <w:t>13/10/2026</w:t>
             </w:r>
           </w:p>
         </w:tc>
@@ -559,7 +559,7 @@
                 <w:noProof/>
                 <w:lang w:val="es-GT"/>
               </w:rPr>
-              <w:t xml:space="preserve">Corrección del documento conforme a lo implementado: botones de descarga en Excel y PDF, flujos alternos de descarga y validación del código de seguimiento</w:t>
+              <w:t>Corrección del documento conforme a lo implementado: botones de descarga en Excel y PDF, flujos alternos de descarga y validación del código de seguimiento</w:t>
             </w:r>
           </w:p>
         </w:tc>
@@ -586,7 +586,7 @@
                 <w:noProof/>
                 <w:lang w:val="es-GT"/>
               </w:rPr>
-              <w:t xml:space="preserve">1.0</w:t>
+              <w:t>1.0</w:t>
             </w:r>
           </w:p>
         </w:tc>
@@ -610,6 +610,13 @@
                 <w:lang w:val="es-GT"/>
               </w:rPr>
             </w:pPr>
+            <w:r>
+              <w:rPr>
+                <w:noProof/>
+                <w:lang w:val="es-GT"/>
+              </w:rPr>
+              <w:t>grupo 1 Análisis de Sistemas 2</w:t>
+            </w:r>
           </w:p>
         </w:tc>
         <w:tc>
@@ -630,6 +637,13 @@
                 <w:lang w:val="es-GT"/>
               </w:rPr>
             </w:pPr>
+            <w:r>
+              <w:rPr>
+                <w:noProof/>
+                <w:lang w:val="es-GT"/>
+              </w:rPr>
+              <w:t>14/10/2026</w:t>
+            </w:r>
           </w:p>
         </w:tc>
         <w:tc>
@@ -650,6 +664,13 @@
                 <w:lang w:val="es-GT"/>
               </w:rPr>
             </w:pPr>
+            <w:r>
+              <w:rPr>
+                <w:noProof/>
+                <w:lang w:val="es-GT"/>
+              </w:rPr>
+              <w:t>Filtro Departamento del formulario reportes estadísticos (RN32)</w:t>
+            </w:r>
           </w:p>
         </w:tc>
         <w:tc>
@@ -670,6 +691,13 @@
                 <w:lang w:val="es-GT"/>
               </w:rPr>
             </w:pPr>
+            <w:r>
+              <w:rPr>
+                <w:noProof/>
+                <w:lang w:val="es-GT"/>
+              </w:rPr>
+              <w:t>1.0</w:t>
+            </w:r>
           </w:p>
         </w:tc>
       </w:tr>
@@ -919,7 +947,25 @@
           <w:szCs w:val="20"/>
           <w:lang w:val="es-ES_tradnl"/>
         </w:rPr>
-        <w:t xml:space="preserve">Permitir que el Supervisor, el Jefe de Departamento y el Administrador generen el reporte estadístico de los casos gestionados por el sistema y el reporte de trazabilidad de un caso en particular, y los descarguen en formato Excel o PDF.</w:t>
+        <w:t xml:space="preserve">Permitir que el Supervisor, el </w:t>
+      </w:r>
+      <w:proofErr w:type="gramStart"/>
+      <w:r>
+        <w:rPr>
+          <w:sz w:val="20"/>
+          <w:szCs w:val="20"/>
+          <w:lang w:val="es-ES_tradnl"/>
+        </w:rPr>
+        <w:t>Jefe</w:t>
+      </w:r>
+      <w:proofErr w:type="gramEnd"/>
+      <w:r>
+        <w:rPr>
+          <w:sz w:val="20"/>
+          <w:szCs w:val="20"/>
+          <w:lang w:val="es-ES_tradnl"/>
+        </w:rPr>
+        <w:t xml:space="preserve"> de Departamento y el Administrador generen el reporte estadístico de los casos gestionados por el sistema y el reporte de trazabilidad de un caso en particular, y los descarguen en formato Excel o PDF.</w:t>
       </w:r>
     </w:p>
     <w:p>
@@ -992,7 +1038,7 @@
           <w:szCs w:val="20"/>
           <w:lang w:val="es-ES_tradnl"/>
         </w:rPr>
-        <w:t xml:space="preserve">Sistema web</w:t>
+        <w:t>Sistema web</w:t>
       </w:r>
     </w:p>
     <w:p>
@@ -1013,7 +1059,25 @@
           <w:szCs w:val="20"/>
           <w:lang w:val="es-ES_tradnl"/>
         </w:rPr>
-        <w:t xml:space="preserve">Usuario empleado municipal con rol de Supervisor, Jefe de Departamento o Administrador</w:t>
+        <w:t xml:space="preserve">Usuario empleado municipal con rol de Supervisor, </w:t>
+      </w:r>
+      <w:proofErr w:type="gramStart"/>
+      <w:r>
+        <w:rPr>
+          <w:sz w:val="20"/>
+          <w:szCs w:val="20"/>
+          <w:lang w:val="es-ES_tradnl"/>
+        </w:rPr>
+        <w:t>Jefe</w:t>
+      </w:r>
+      <w:proofErr w:type="gramEnd"/>
+      <w:r>
+        <w:rPr>
+          <w:sz w:val="20"/>
+          <w:szCs w:val="20"/>
+          <w:lang w:val="es-ES_tradnl"/>
+        </w:rPr>
+        <w:t xml:space="preserve"> de Departamento o Administrador</w:t>
       </w:r>
     </w:p>
     <w:p>
@@ -1056,7 +1120,7 @@
           <w:szCs w:val="20"/>
           <w:lang w:val="es-ES_tradnl"/>
         </w:rPr>
-        <w:t xml:space="preserve">Que el sistema web se encuentre disponible.</w:t>
+        <w:t>Que el sistema web se encuentre disponible.</w:t>
       </w:r>
     </w:p>
     <w:p>
@@ -1077,7 +1141,25 @@
           <w:szCs w:val="20"/>
           <w:lang w:val="es-ES_tradnl"/>
         </w:rPr>
-        <w:t xml:space="preserve">Que el usuario haya iniciado sesión con el rol de Supervisor, Jefe de Departamento o Administrador.</w:t>
+        <w:t xml:space="preserve">Que el usuario haya iniciado sesión con el rol de Supervisor, </w:t>
+      </w:r>
+      <w:proofErr w:type="gramStart"/>
+      <w:r>
+        <w:rPr>
+          <w:sz w:val="20"/>
+          <w:szCs w:val="20"/>
+          <w:lang w:val="es-ES_tradnl"/>
+        </w:rPr>
+        <w:t>Jefe</w:t>
+      </w:r>
+      <w:proofErr w:type="gramEnd"/>
+      <w:r>
+        <w:rPr>
+          <w:sz w:val="20"/>
+          <w:szCs w:val="20"/>
+          <w:lang w:val="es-ES_tradnl"/>
+        </w:rPr>
+        <w:t xml:space="preserve"> de Departamento o Administrador.</w:t>
       </w:r>
     </w:p>
     <w:p>
@@ -1138,7 +1220,7 @@
           <w:szCs w:val="20"/>
           <w:lang w:val="es-ES_tradnl"/>
         </w:rPr>
-        <w:t xml:space="preserve">Ver CU01</w:t>
+        <w:t>Ver CU01</w:t>
       </w:r>
     </w:p>
     <w:p>
@@ -1159,7 +1241,7 @@
           <w:szCs w:val="20"/>
           <w:lang w:val="es-ES_tradnl"/>
         </w:rPr>
-        <w:t xml:space="preserve">El sistema muestra la bandeja principal que corresponde a su rol, con el menú Reportería entre sus opciones.</w:t>
+        <w:t>El sistema muestra la bandeja principal que corresponde a su rol, con el menú Reportería entre sus opciones.</w:t>
       </w:r>
     </w:p>
     <w:p>
@@ -1180,7 +1262,7 @@
           <w:szCs w:val="20"/>
           <w:lang w:val="es-ES_tradnl"/>
         </w:rPr>
-        <w:t xml:space="preserve">Reportería</w:t>
+        <w:t>Reportería</w:t>
       </w:r>
     </w:p>
     <w:p>
@@ -1211,7 +1293,7 @@
           <w:szCs w:val="20"/>
           <w:lang w:val="es-ES_tradnl"/>
         </w:rPr>
-        <w:t xml:space="preserve">FA01</w:t>
+        <w:t>FA01</w:t>
       </w:r>
     </w:p>
     <w:p>
@@ -1232,7 +1314,7 @@
           <w:szCs w:val="20"/>
           <w:lang w:val="es-ES_tradnl"/>
         </w:rPr>
-        <w:t xml:space="preserve">El usuario selecciona el menú “Reportería”.</w:t>
+        <w:t>El usuario selecciona el menú “Reportería”.</w:t>
       </w:r>
     </w:p>
     <w:p>
@@ -1253,7 +1335,46 @@
           <w:szCs w:val="20"/>
           <w:lang w:val="es-ES_tradnl"/>
         </w:rPr>
-        <w:t xml:space="preserve">El sistema muestra las siguientes secciones.</w:t>
+        <w:t xml:space="preserve">El sistema muestra el </w:t>
+      </w:r>
+      <w:proofErr w:type="spellStart"/>
+      <w:r>
+        <w:rPr>
+          <w:sz w:val="20"/>
+          <w:szCs w:val="20"/>
+          <w:lang w:val="es-ES_tradnl"/>
+        </w:rPr>
+        <w:t>titulo</w:t>
+      </w:r>
+      <w:proofErr w:type="spellEnd"/>
+      <w:r>
+        <w:rPr>
+          <w:sz w:val="20"/>
+          <w:szCs w:val="20"/>
+          <w:lang w:val="es-ES_tradnl"/>
+        </w:rPr>
+        <w:t xml:space="preserve"> “Reportería”</w:t>
+      </w:r>
+    </w:p>
+    <w:p>
+      <w:pPr>
+        <w:numPr>
+          <w:ilvl w:val="0"/>
+          <w:numId w:val="19"/>
+        </w:numPr>
+        <w:rPr>
+          <w:sz w:val="20"/>
+          <w:szCs w:val="20"/>
+          <w:lang w:val="es-ES_tradnl"/>
+        </w:rPr>
+      </w:pPr>
+      <w:r>
+        <w:rPr>
+          <w:sz w:val="20"/>
+          <w:szCs w:val="20"/>
+          <w:lang w:val="es-ES_tradnl"/>
+        </w:rPr>
+        <w:t>El sistema muestra las siguientes secciones.</w:t>
       </w:r>
     </w:p>
     <w:p>
@@ -1274,7 +1395,7 @@
           <w:szCs w:val="20"/>
           <w:lang w:val="es-ES_tradnl"/>
         </w:rPr>
-        <w:t xml:space="preserve">Reportes Estadísticos</w:t>
+        <w:t>Reportes Estadísticos</w:t>
       </w:r>
     </w:p>
     <w:p>
@@ -1305,7 +1426,7 @@
           <w:szCs w:val="20"/>
           <w:lang w:val="es-ES_tradnl"/>
         </w:rPr>
-        <w:t xml:space="preserve">FA02</w:t>
+        <w:t>FA02</w:t>
       </w:r>
     </w:p>
     <w:p>
@@ -1336,7 +1457,7 @@
           <w:szCs w:val="20"/>
           <w:lang w:val="es-ES_tradnl"/>
         </w:rPr>
-        <w:t xml:space="preserve">RN32</w:t>
+        <w:t>RN32</w:t>
       </w:r>
     </w:p>
     <w:p>
@@ -1357,7 +1478,7 @@
           <w:szCs w:val="20"/>
           <w:lang w:val="es-ES_tradnl"/>
         </w:rPr>
-        <w:t xml:space="preserve">El usuario ingresa las fechas del periodo y selecciona el tipo de caso y el estado que desea consultar. </w:t>
+        <w:t xml:space="preserve">El usuario ingresa las fechas del periodo y selecciona el tipo de caso, el estado y el departamento que desea consultar. </w:t>
       </w:r>
       <w:r>
         <w:rPr>
@@ -1367,7 +1488,7 @@
           <w:szCs w:val="20"/>
           <w:lang w:val="es-ES_tradnl"/>
         </w:rPr>
-        <w:t xml:space="preserve">RN32</w:t>
+        <w:t>RN32</w:t>
       </w:r>
     </w:p>
     <w:p>
@@ -1398,7 +1519,7 @@
           <w:szCs w:val="20"/>
           <w:lang w:val="es-ES_tradnl"/>
         </w:rPr>
-        <w:t xml:space="preserve">FA03, FA04</w:t>
+        <w:t>FA03, FA04</w:t>
       </w:r>
     </w:p>
     <w:p>
@@ -1429,7 +1550,7 @@
           <w:szCs w:val="20"/>
           <w:lang w:val="es-ES_tradnl"/>
         </w:rPr>
-        <w:t xml:space="preserve">RN32</w:t>
+        <w:t>RN32</w:t>
       </w:r>
     </w:p>
     <w:p>
@@ -1450,7 +1571,164 @@
           <w:szCs w:val="20"/>
           <w:lang w:val="es-ES_tradnl"/>
         </w:rPr>
-        <w:t xml:space="preserve">El sistema muestra los siguientes botones.</w:t>
+        <w:t>El sistema muestra el título “Reporte estadístico de casos” con el periodo seleccionado previamente.</w:t>
+      </w:r>
+    </w:p>
+    <w:p>
+      <w:pPr>
+        <w:numPr>
+          <w:ilvl w:val="0"/>
+          <w:numId w:val="19"/>
+        </w:numPr>
+        <w:rPr>
+          <w:sz w:val="20"/>
+          <w:szCs w:val="20"/>
+          <w:lang w:val="es-ES_tradnl"/>
+        </w:rPr>
+      </w:pPr>
+      <w:r>
+        <w:rPr>
+          <w:sz w:val="20"/>
+          <w:szCs w:val="20"/>
+          <w:lang w:val="es-ES_tradnl"/>
+        </w:rPr>
+        <w:t>El sistema muestra totales por categoría y en general de la siguiente información</w:t>
+      </w:r>
+    </w:p>
+    <w:p>
+      <w:pPr>
+        <w:numPr>
+          <w:ilvl w:val="0"/>
+          <w:numId w:val="32"/>
+        </w:numPr>
+        <w:rPr>
+          <w:sz w:val="20"/>
+          <w:szCs w:val="20"/>
+          <w:lang w:val="es-ES_tradnl"/>
+        </w:rPr>
+      </w:pPr>
+      <w:proofErr w:type="gramStart"/>
+      <w:r>
+        <w:rPr>
+          <w:sz w:val="20"/>
+          <w:szCs w:val="20"/>
+          <w:lang w:val="es-ES_tradnl"/>
+        </w:rPr>
+        <w:t>Total</w:t>
+      </w:r>
+      <w:proofErr w:type="gramEnd"/>
+      <w:r>
+        <w:rPr>
+          <w:sz w:val="20"/>
+          <w:szCs w:val="20"/>
+          <w:lang w:val="es-ES_tradnl"/>
+        </w:rPr>
+        <w:t xml:space="preserve"> de casos</w:t>
+      </w:r>
+    </w:p>
+    <w:p>
+      <w:pPr>
+        <w:numPr>
+          <w:ilvl w:val="0"/>
+          <w:numId w:val="32"/>
+        </w:numPr>
+        <w:rPr>
+          <w:sz w:val="20"/>
+          <w:szCs w:val="20"/>
+          <w:lang w:val="es-ES_tradnl"/>
+        </w:rPr>
+      </w:pPr>
+      <w:r>
+        <w:rPr>
+          <w:sz w:val="20"/>
+          <w:szCs w:val="20"/>
+          <w:lang w:val="es-ES_tradnl"/>
+        </w:rPr>
+        <w:t>Casos por estado</w:t>
+      </w:r>
+    </w:p>
+    <w:p>
+      <w:pPr>
+        <w:numPr>
+          <w:ilvl w:val="0"/>
+          <w:numId w:val="32"/>
+        </w:numPr>
+        <w:rPr>
+          <w:sz w:val="20"/>
+          <w:szCs w:val="20"/>
+          <w:lang w:val="es-ES_tradnl"/>
+        </w:rPr>
+      </w:pPr>
+      <w:r>
+        <w:rPr>
+          <w:sz w:val="20"/>
+          <w:szCs w:val="20"/>
+          <w:lang w:val="es-ES_tradnl"/>
+        </w:rPr>
+        <w:t>Casos por tipo de caso</w:t>
+      </w:r>
+    </w:p>
+    <w:p>
+      <w:pPr>
+        <w:numPr>
+          <w:ilvl w:val="0"/>
+          <w:numId w:val="32"/>
+        </w:numPr>
+        <w:rPr>
+          <w:sz w:val="20"/>
+          <w:szCs w:val="20"/>
+          <w:lang w:val="es-ES_tradnl"/>
+        </w:rPr>
+      </w:pPr>
+      <w:r>
+        <w:rPr>
+          <w:sz w:val="20"/>
+          <w:szCs w:val="20"/>
+          <w:lang w:val="es-ES_tradnl"/>
+        </w:rPr>
+        <w:t>Casos por departamento</w:t>
+      </w:r>
+    </w:p>
+    <w:p>
+      <w:pPr>
+        <w:numPr>
+          <w:ilvl w:val="0"/>
+          <w:numId w:val="32"/>
+        </w:numPr>
+        <w:rPr>
+          <w:sz w:val="20"/>
+          <w:szCs w:val="20"/>
+          <w:lang w:val="es-ES_tradnl"/>
+        </w:rPr>
+      </w:pPr>
+      <w:r>
+        <w:rPr>
+          <w:sz w:val="20"/>
+          <w:szCs w:val="20"/>
+          <w:lang w:val="es-ES_tradnl"/>
+        </w:rPr>
+        <w:t>Casos por categoría</w:t>
+      </w:r>
+    </w:p>
+    <w:p>
+      <w:pPr>
+        <w:numPr>
+          <w:ilvl w:val="0"/>
+          <w:numId w:val="19"/>
+        </w:numPr>
+        <w:rPr>
+          <w:sz w:val="20"/>
+          <w:szCs w:val="20"/>
+          <w:lang w:val="es-ES_tradnl"/>
+        </w:rPr>
+      </w:pPr>
+      <w:r>
+        <w:rPr>
+          <w:sz w:val="20"/>
+          <w:szCs w:val="20"/>
+          <w:lang w:val="es-ES_tradnl"/>
+        </w:rPr>
+        <w:t>El sistema muestra los siguientes botones.</w:t>
       </w:r>
     </w:p>
     <w:p>
@@ -1481,7 +1759,7 @@
           <w:szCs w:val="20"/>
           <w:lang w:val="es-ES_tradnl"/>
         </w:rPr>
-        <w:t xml:space="preserve">FA05</w:t>
+        <w:t>FA05</w:t>
       </w:r>
     </w:p>
     <w:p>
@@ -1512,7 +1790,7 @@
           <w:szCs w:val="20"/>
           <w:lang w:val="es-ES_tradnl"/>
         </w:rPr>
-        <w:t xml:space="preserve">FA06</w:t>
+        <w:t>FA06</w:t>
       </w:r>
     </w:p>
     <w:p>
@@ -1533,7 +1811,7 @@
           <w:szCs w:val="20"/>
           <w:lang w:val="es-ES_tradnl"/>
         </w:rPr>
-        <w:t xml:space="preserve">Fin del caso de uso.</w:t>
+        <w:t>Fin del caso de uso.</w:t>
       </w:r>
     </w:p>
     <w:p>
@@ -1576,7 +1854,7 @@
           <w:szCs w:val="20"/>
           <w:lang w:val="es-ES_tradnl"/>
         </w:rPr>
-        <w:t xml:space="preserve">FA01 Cerrar sesión</w:t>
+        <w:t>FA01 Cerrar sesión</w:t>
       </w:r>
     </w:p>
     <w:p>
@@ -1597,7 +1875,7 @@
           <w:szCs w:val="20"/>
           <w:lang w:val="es-ES_tradnl"/>
         </w:rPr>
-        <w:t xml:space="preserve">El usuario selecciona el botón “Cerrar sesión”</w:t>
+        <w:t>El usuario selecciona el botón “Cerrar sesión”</w:t>
       </w:r>
     </w:p>
     <w:p>
@@ -1628,7 +1906,7 @@
           <w:szCs w:val="20"/>
           <w:lang w:val="es-ES_tradnl"/>
         </w:rPr>
-        <w:t xml:space="preserve">Ver CU12</w:t>
+        <w:t>Ver CU12</w:t>
       </w:r>
     </w:p>
     <w:p>
@@ -1649,7 +1927,7 @@
           <w:szCs w:val="20"/>
           <w:lang w:val="es-ES_tradnl"/>
         </w:rPr>
-        <w:t xml:space="preserve">El sistema retorna al portal web.</w:t>
+        <w:t>El sistema retorna al portal web.</w:t>
       </w:r>
     </w:p>
     <w:p>
@@ -1670,7 +1948,7 @@
           <w:szCs w:val="20"/>
           <w:lang w:val="es-ES_tradnl"/>
         </w:rPr>
-        <w:t xml:space="preserve">Fin de flujo alterno.</w:t>
+        <w:t>Fin de flujo alterno.</w:t>
       </w:r>
     </w:p>
     <w:p>
@@ -1700,7 +1978,7 @@
           <w:szCs w:val="20"/>
           <w:lang w:val="es-ES_tradnl"/>
         </w:rPr>
-        <w:t xml:space="preserve">FA02 Trazabilidad del caso</w:t>
+        <w:t>FA02 Trazabilidad del caso</w:t>
       </w:r>
     </w:p>
     <w:p>
@@ -1721,7 +1999,8 @@
           <w:szCs w:val="20"/>
           <w:lang w:val="es-ES_tradnl"/>
         </w:rPr>
-        <w:t xml:space="preserve">El usuario selecciona la sección “Trazabilidad del Caso”.</w:t>
+        <w:lastRenderedPageBreak/>
+        <w:t>El usuario selecciona la sección “Trazabilidad del Caso”.</w:t>
       </w:r>
     </w:p>
     <w:p>
@@ -1752,7 +2031,7 @@
           <w:szCs w:val="20"/>
           <w:lang w:val="es-ES_tradnl"/>
         </w:rPr>
-        <w:t xml:space="preserve">RN33</w:t>
+        <w:t>RN33</w:t>
       </w:r>
     </w:p>
     <w:p>
@@ -1783,7 +2062,7 @@
           <w:szCs w:val="20"/>
           <w:lang w:val="es-ES_tradnl"/>
         </w:rPr>
-        <w:t xml:space="preserve">FA07, FA08</w:t>
+        <w:t>FA07, FA08</w:t>
       </w:r>
     </w:p>
     <w:p>
@@ -1814,7 +2093,7 @@
           <w:szCs w:val="20"/>
           <w:lang w:val="es-ES_tradnl"/>
         </w:rPr>
-        <w:t xml:space="preserve">RN33</w:t>
+        <w:t>RN33</w:t>
       </w:r>
     </w:p>
     <w:p>
@@ -1835,7 +2114,7 @@
           <w:szCs w:val="20"/>
           <w:lang w:val="es-ES_tradnl"/>
         </w:rPr>
-        <w:t xml:space="preserve">El sistema muestra los siguientes botones.</w:t>
+        <w:t>El sistema muestra los siguientes botones.</w:t>
       </w:r>
     </w:p>
     <w:p>
@@ -1856,7 +2135,7 @@
           <w:szCs w:val="20"/>
           <w:lang w:val="es-ES_tradnl"/>
         </w:rPr>
-        <w:t xml:space="preserve">Descargar Excel</w:t>
+        <w:t>Descargar Excel</w:t>
       </w:r>
     </w:p>
     <w:p>
@@ -1877,7 +2156,7 @@
           <w:szCs w:val="20"/>
           <w:lang w:val="es-ES_tradnl"/>
         </w:rPr>
-        <w:t xml:space="preserve">Descargar PDF</w:t>
+        <w:t>Descargar PDF</w:t>
       </w:r>
     </w:p>
     <w:p>
@@ -1898,7 +2177,7 @@
           <w:szCs w:val="20"/>
           <w:lang w:val="es-ES_tradnl"/>
         </w:rPr>
-        <w:t xml:space="preserve">El usuario selecciona el botón con el que desea descargar el reporte.</w:t>
+        <w:t>El usuario selecciona el botón con el que desea descargar el reporte.</w:t>
       </w:r>
     </w:p>
     <w:p>
@@ -1929,7 +2208,7 @@
           <w:szCs w:val="20"/>
           <w:lang w:val="es-ES_tradnl"/>
         </w:rPr>
-        <w:t xml:space="preserve">AN04 # 6</w:t>
+        <w:t>AN04 # 6</w:t>
       </w:r>
     </w:p>
     <w:p>
@@ -1950,7 +2229,7 @@
           <w:szCs w:val="20"/>
           <w:lang w:val="es-ES_tradnl"/>
         </w:rPr>
-        <w:t xml:space="preserve">El sistema retorna al paso 4 del flujo alterno FA02.</w:t>
+        <w:t>El sistema retorna al paso 4 del flujo alterno FA02.</w:t>
       </w:r>
     </w:p>
     <w:p>
@@ -1971,7 +2250,7 @@
           <w:szCs w:val="20"/>
           <w:lang w:val="es-ES_tradnl"/>
         </w:rPr>
-        <w:t xml:space="preserve">Fin de flujo alterno.</w:t>
+        <w:t>Fin de flujo alterno.</w:t>
       </w:r>
     </w:p>
     <w:p>
@@ -2001,7 +2280,7 @@
           <w:szCs w:val="20"/>
           <w:lang w:val="es-ES_tradnl"/>
         </w:rPr>
-        <w:t xml:space="preserve">FA03 Rango de fechas no válido</w:t>
+        <w:t>FA03 Rango de fechas no válido</w:t>
       </w:r>
     </w:p>
     <w:p>
@@ -2032,7 +2311,7 @@
           <w:szCs w:val="20"/>
           <w:lang w:val="es-ES_tradnl"/>
         </w:rPr>
-        <w:t xml:space="preserve">RN32</w:t>
+        <w:t>RN32</w:t>
       </w:r>
     </w:p>
     <w:p>
@@ -2063,7 +2342,7 @@
           <w:szCs w:val="20"/>
           <w:lang w:val="es-ES_tradnl"/>
         </w:rPr>
-        <w:t xml:space="preserve">AN02 # 30</w:t>
+        <w:t>AN02 # 30</w:t>
       </w:r>
     </w:p>
     <w:p>
@@ -2084,7 +2363,7 @@
           <w:szCs w:val="20"/>
           <w:lang w:val="es-ES_tradnl"/>
         </w:rPr>
-        <w:t xml:space="preserve">El sistema retorna al paso 6 del flujo básico, para corregir.</w:t>
+        <w:t>El sistema retorna al paso 6 del flujo básico, para corregir.</w:t>
       </w:r>
     </w:p>
     <w:p>
@@ -2105,7 +2384,7 @@
           <w:szCs w:val="20"/>
           <w:lang w:val="es-ES_tradnl"/>
         </w:rPr>
-        <w:t xml:space="preserve">Fin de flujo alterno.</w:t>
+        <w:t>Fin de flujo alterno.</w:t>
       </w:r>
     </w:p>
     <w:p>
@@ -2135,7 +2414,7 @@
           <w:szCs w:val="20"/>
           <w:lang w:val="es-ES_tradnl"/>
         </w:rPr>
-        <w:t xml:space="preserve">FA04 No existen registros para los filtros aplicados</w:t>
+        <w:t>FA04 No existen registros para los filtros aplicados</w:t>
       </w:r>
     </w:p>
     <w:p>
@@ -2156,7 +2435,7 @@
           <w:szCs w:val="20"/>
           <w:lang w:val="es-ES_tradnl"/>
         </w:rPr>
-        <w:t xml:space="preserve">El sistema valida que existan casos registrados para los filtros aplicados.</w:t>
+        <w:t>El sistema valida que existan casos registrados para los filtros aplicados.</w:t>
       </w:r>
     </w:p>
     <w:p>
@@ -2187,7 +2466,7 @@
           <w:szCs w:val="20"/>
           <w:lang w:val="es-ES_tradnl"/>
         </w:rPr>
-        <w:t xml:space="preserve">AN02 # 31</w:t>
+        <w:t>AN02 # 31</w:t>
       </w:r>
     </w:p>
     <w:p>
@@ -2208,7 +2487,7 @@
           <w:szCs w:val="20"/>
           <w:lang w:val="es-ES_tradnl"/>
         </w:rPr>
-        <w:t xml:space="preserve">El sistema retorna al paso 6 del flujo básico, para corregir.</w:t>
+        <w:t>El sistema retorna al paso 6 del flujo básico, para corregir.</w:t>
       </w:r>
     </w:p>
     <w:p>
@@ -2229,7 +2508,7 @@
           <w:szCs w:val="20"/>
           <w:lang w:val="es-ES_tradnl"/>
         </w:rPr>
-        <w:t xml:space="preserve">Fin de flujo alterno.</w:t>
+        <w:t>Fin de flujo alterno.</w:t>
       </w:r>
     </w:p>
     <w:p>
@@ -2259,7 +2538,7 @@
           <w:szCs w:val="20"/>
           <w:lang w:val="es-ES_tradnl"/>
         </w:rPr>
-        <w:t xml:space="preserve">FA05 Descargar el reporte estadístico en Excel</w:t>
+        <w:t>FA05 Descargar el reporte estadístico en Excel</w:t>
       </w:r>
     </w:p>
     <w:p>
@@ -2280,7 +2559,7 @@
           <w:szCs w:val="20"/>
           <w:lang w:val="es-ES_tradnl"/>
         </w:rPr>
-        <w:t xml:space="preserve">El usuario selecciona el botón “Descargar Excel”.</w:t>
+        <w:t>El usuario selecciona el botón “Descargar Excel”.</w:t>
       </w:r>
     </w:p>
     <w:p>
@@ -2301,9 +2580,70 @@
           <w:szCs w:val="20"/>
           <w:lang w:val="es-ES_tradnl"/>
         </w:rPr>
-        <w:t xml:space="preserve">El sistema genera el reporte estadístico de casos en formato Excel con los filtros aplicados. </w:t>
-      </w:r>
-      <w:r>
+        <w:t>El sistema genera el reporte estadístico de casos en formato Excel con los filtros aplicados</w:t>
+      </w:r>
+      <w:r>
+        <w:rPr>
+          <w:sz w:val="20"/>
+          <w:szCs w:val="20"/>
+          <w:lang w:val="es-ES_tradnl"/>
+        </w:rPr>
+        <w:t>.</w:t>
+      </w:r>
+    </w:p>
+    <w:p>
+      <w:pPr>
+        <w:numPr>
+          <w:ilvl w:val="0"/>
+          <w:numId w:val="26"/>
+        </w:numPr>
+        <w:rPr>
+          <w:sz w:val="20"/>
+          <w:szCs w:val="20"/>
+          <w:lang w:val="es-ES_tradnl"/>
+        </w:rPr>
+      </w:pPr>
+      <w:r>
+        <w:rPr>
+          <w:sz w:val="20"/>
+          <w:szCs w:val="20"/>
+          <w:lang w:val="es-ES_tradnl"/>
+        </w:rPr>
+        <w:t>El sistema retorna al paso 8 del flujo básico.</w:t>
+      </w:r>
+    </w:p>
+    <w:p>
+      <w:pPr>
+        <w:numPr>
+          <w:ilvl w:val="0"/>
+          <w:numId w:val="26"/>
+        </w:numPr>
+        <w:rPr>
+          <w:sz w:val="20"/>
+          <w:szCs w:val="20"/>
+          <w:lang w:val="es-ES_tradnl"/>
+        </w:rPr>
+      </w:pPr>
+      <w:r>
+        <w:rPr>
+          <w:sz w:val="20"/>
+          <w:szCs w:val="20"/>
+          <w:lang w:val="es-ES_tradnl"/>
+        </w:rPr>
+        <w:t>Fin de flujo alterno.</w:t>
+      </w:r>
+    </w:p>
+    <w:p>
+      <w:pPr>
+        <w:rPr>
+          <w:sz w:val="20"/>
+          <w:szCs w:val="20"/>
+          <w:lang w:val="es-ES_tradnl"/>
+        </w:rPr>
+      </w:pPr>
+    </w:p>
+    <w:p>
+      <w:pPr>
         <w:rPr>
           <w:b/>
           <w:bCs/>
@@ -2311,62 +2651,8 @@
           <w:szCs w:val="20"/>
           <w:lang w:val="es-ES_tradnl"/>
         </w:rPr>
-        <w:t xml:space="preserve">AN04 # 5</w:t>
-      </w:r>
-    </w:p>
-    <w:p>
-      <w:pPr>
-        <w:numPr>
-          <w:ilvl w:val="0"/>
-          <w:numId w:val="26"/>
-        </w:numPr>
-        <w:rPr>
-          <w:sz w:val="20"/>
-          <w:szCs w:val="20"/>
-          <w:lang w:val="es-ES_tradnl"/>
-        </w:rPr>
-      </w:pPr>
-      <w:r>
-        <w:rPr>
-          <w:sz w:val="20"/>
-          <w:szCs w:val="20"/>
-          <w:lang w:val="es-ES_tradnl"/>
-        </w:rPr>
-        <w:t xml:space="preserve">El sistema retorna al paso 8 del flujo básico.</w:t>
-      </w:r>
-    </w:p>
-    <w:p>
-      <w:pPr>
-        <w:numPr>
-          <w:ilvl w:val="0"/>
-          <w:numId w:val="26"/>
-        </w:numPr>
-        <w:rPr>
-          <w:sz w:val="20"/>
-          <w:szCs w:val="20"/>
-          <w:lang w:val="es-ES_tradnl"/>
-        </w:rPr>
-      </w:pPr>
-      <w:r>
-        <w:rPr>
-          <w:sz w:val="20"/>
-          <w:szCs w:val="20"/>
-          <w:lang w:val="es-ES_tradnl"/>
-        </w:rPr>
-        <w:t xml:space="preserve">Fin de flujo alterno.</w:t>
-      </w:r>
-    </w:p>
-    <w:p>
-      <w:pPr>
-        <w:rPr>
-          <w:sz w:val="20"/>
-          <w:szCs w:val="20"/>
-          <w:lang w:val="es-ES_tradnl"/>
-        </w:rPr>
-      </w:pPr>
-    </w:p>
-    <w:p>
-      <w:pPr>
+      </w:pPr>
+      <w:r>
         <w:rPr>
           <w:b/>
           <w:bCs/>
@@ -2374,7 +2660,50 @@
           <w:szCs w:val="20"/>
           <w:lang w:val="es-ES_tradnl"/>
         </w:rPr>
-      </w:pPr>
+        <w:t>FA06 Descargar el reporte estadístico en PDF</w:t>
+      </w:r>
+    </w:p>
+    <w:p>
+      <w:pPr>
+        <w:numPr>
+          <w:ilvl w:val="0"/>
+          <w:numId w:val="28"/>
+        </w:numPr>
+        <w:rPr>
+          <w:sz w:val="20"/>
+          <w:szCs w:val="20"/>
+          <w:lang w:val="es-ES_tradnl"/>
+        </w:rPr>
+      </w:pPr>
+      <w:r>
+        <w:rPr>
+          <w:sz w:val="20"/>
+          <w:szCs w:val="20"/>
+          <w:lang w:val="es-ES_tradnl"/>
+        </w:rPr>
+        <w:t>El usuario selecciona el botón “Descargar PDF”.</w:t>
+      </w:r>
+    </w:p>
+    <w:p>
+      <w:pPr>
+        <w:numPr>
+          <w:ilvl w:val="0"/>
+          <w:numId w:val="28"/>
+        </w:numPr>
+        <w:rPr>
+          <w:sz w:val="20"/>
+          <w:szCs w:val="20"/>
+          <w:lang w:val="es-ES_tradnl"/>
+        </w:rPr>
+      </w:pPr>
+      <w:r>
+        <w:rPr>
+          <w:sz w:val="20"/>
+          <w:szCs w:val="20"/>
+          <w:lang w:val="es-ES_tradnl"/>
+        </w:rPr>
+        <w:t xml:space="preserve">El sistema genera el reporte estadístico de casos en formato PDF con los filtros aplicados. </w:t>
+      </w:r>
       <w:r>
         <w:rPr>
           <w:b/>
@@ -2383,7 +2712,7 @@
           <w:szCs w:val="20"/>
           <w:lang w:val="es-ES_tradnl"/>
         </w:rPr>
-        <w:t xml:space="preserve">FA06 Descargar el reporte estadístico en PDF</w:t>
+        <w:t>AN04 # 5</w:t>
       </w:r>
     </w:p>
     <w:p>
@@ -2404,7 +2733,7 @@
           <w:szCs w:val="20"/>
           <w:lang w:val="es-ES_tradnl"/>
         </w:rPr>
-        <w:t xml:space="preserve">El usuario selecciona el botón “Descargar PDF”.</w:t>
+        <w:t>El sistema retorna al paso 8 del flujo básico.</w:t>
       </w:r>
     </w:p>
     <w:p>
@@ -2425,9 +2754,20 @@
           <w:szCs w:val="20"/>
           <w:lang w:val="es-ES_tradnl"/>
         </w:rPr>
-        <w:t xml:space="preserve">El sistema genera el reporte estadístico de casos en formato PDF con los filtros aplicados. </w:t>
-      </w:r>
-      <w:r>
+        <w:t>Fin de flujo alterno.</w:t>
+      </w:r>
+    </w:p>
+    <w:p>
+      <w:pPr>
+        <w:rPr>
+          <w:sz w:val="20"/>
+          <w:szCs w:val="20"/>
+          <w:lang w:val="es-ES_tradnl"/>
+        </w:rPr>
+      </w:pPr>
+    </w:p>
+    <w:p>
+      <w:pPr>
         <w:rPr>
           <w:b/>
           <w:bCs/>
@@ -2435,62 +2775,8 @@
           <w:szCs w:val="20"/>
           <w:lang w:val="es-ES_tradnl"/>
         </w:rPr>
-        <w:t xml:space="preserve">AN04 # 5</w:t>
-      </w:r>
-    </w:p>
-    <w:p>
-      <w:pPr>
-        <w:numPr>
-          <w:ilvl w:val="0"/>
-          <w:numId w:val="28"/>
-        </w:numPr>
-        <w:rPr>
-          <w:sz w:val="20"/>
-          <w:szCs w:val="20"/>
-          <w:lang w:val="es-ES_tradnl"/>
-        </w:rPr>
-      </w:pPr>
-      <w:r>
-        <w:rPr>
-          <w:sz w:val="20"/>
-          <w:szCs w:val="20"/>
-          <w:lang w:val="es-ES_tradnl"/>
-        </w:rPr>
-        <w:t xml:space="preserve">El sistema retorna al paso 8 del flujo básico.</w:t>
-      </w:r>
-    </w:p>
-    <w:p>
-      <w:pPr>
-        <w:numPr>
-          <w:ilvl w:val="0"/>
-          <w:numId w:val="28"/>
-        </w:numPr>
-        <w:rPr>
-          <w:sz w:val="20"/>
-          <w:szCs w:val="20"/>
-          <w:lang w:val="es-ES_tradnl"/>
-        </w:rPr>
-      </w:pPr>
-      <w:r>
-        <w:rPr>
-          <w:sz w:val="20"/>
-          <w:szCs w:val="20"/>
-          <w:lang w:val="es-ES_tradnl"/>
-        </w:rPr>
-        <w:t xml:space="preserve">Fin de flujo alterno.</w:t>
-      </w:r>
-    </w:p>
-    <w:p>
-      <w:pPr>
-        <w:rPr>
-          <w:sz w:val="20"/>
-          <w:szCs w:val="20"/>
-          <w:lang w:val="es-ES_tradnl"/>
-        </w:rPr>
-      </w:pPr>
-    </w:p>
-    <w:p>
-      <w:pPr>
+      </w:pPr>
+      <w:r>
         <w:rPr>
           <w:b/>
           <w:bCs/>
@@ -2498,7 +2784,29 @@
           <w:szCs w:val="20"/>
           <w:lang w:val="es-ES_tradnl"/>
         </w:rPr>
-      </w:pPr>
+        <w:t>FA07 Código de seguimiento no ingresado</w:t>
+      </w:r>
+    </w:p>
+    <w:p>
+      <w:pPr>
+        <w:numPr>
+          <w:ilvl w:val="0"/>
+          <w:numId w:val="29"/>
+        </w:numPr>
+        <w:rPr>
+          <w:sz w:val="20"/>
+          <w:szCs w:val="20"/>
+          <w:lang w:val="es-ES_tradnl"/>
+        </w:rPr>
+      </w:pPr>
+      <w:r>
+        <w:rPr>
+          <w:sz w:val="20"/>
+          <w:szCs w:val="20"/>
+          <w:lang w:val="es-ES_tradnl"/>
+        </w:rPr>
+        <w:t xml:space="preserve">El sistema valida que se haya ingresado el código de seguimiento. </w:t>
+      </w:r>
       <w:r>
         <w:rPr>
           <w:b/>
@@ -2507,7 +2815,7 @@
           <w:szCs w:val="20"/>
           <w:lang w:val="es-ES_tradnl"/>
         </w:rPr>
-        <w:t xml:space="preserve">FA07 Código de seguimiento no ingresado</w:t>
+        <w:t>RN33</w:t>
       </w:r>
     </w:p>
     <w:p>
@@ -2528,7 +2836,7 @@
           <w:szCs w:val="20"/>
           <w:lang w:val="es-ES_tradnl"/>
         </w:rPr>
-        <w:t xml:space="preserve">El sistema valida que se haya ingresado el código de seguimiento. </w:t>
+        <w:t xml:space="preserve">El sistema muestra el mensaje de error. </w:t>
       </w:r>
       <w:r>
         <w:rPr>
@@ -2538,7 +2846,7 @@
           <w:szCs w:val="20"/>
           <w:lang w:val="es-ES_tradnl"/>
         </w:rPr>
-        <w:t xml:space="preserve">RN33</w:t>
+        <w:t>AN02 # 15</w:t>
       </w:r>
     </w:p>
     <w:p>
@@ -2559,9 +2867,41 @@
           <w:szCs w:val="20"/>
           <w:lang w:val="es-ES_tradnl"/>
         </w:rPr>
-        <w:t xml:space="preserve">El sistema muestra el mensaje de error. </w:t>
-      </w:r>
-      <w:r>
+        <w:t>El sistema retorna al paso 3 del flujo alterno FA02, para corregir.</w:t>
+      </w:r>
+    </w:p>
+    <w:p>
+      <w:pPr>
+        <w:numPr>
+          <w:ilvl w:val="0"/>
+          <w:numId w:val="29"/>
+        </w:numPr>
+        <w:rPr>
+          <w:sz w:val="20"/>
+          <w:szCs w:val="20"/>
+          <w:lang w:val="es-ES_tradnl"/>
+        </w:rPr>
+      </w:pPr>
+      <w:r>
+        <w:rPr>
+          <w:sz w:val="20"/>
+          <w:szCs w:val="20"/>
+          <w:lang w:val="es-ES_tradnl"/>
+        </w:rPr>
+        <w:t>Fin de flujo alterno.</w:t>
+      </w:r>
+    </w:p>
+    <w:p>
+      <w:pPr>
+        <w:rPr>
+          <w:sz w:val="20"/>
+          <w:szCs w:val="20"/>
+          <w:lang w:val="es-ES_tradnl"/>
+        </w:rPr>
+      </w:pPr>
+    </w:p>
+    <w:p>
+      <w:pPr>
         <w:rPr>
           <w:b/>
           <w:bCs/>
@@ -2569,62 +2909,8 @@
           <w:szCs w:val="20"/>
           <w:lang w:val="es-ES_tradnl"/>
         </w:rPr>
-        <w:t xml:space="preserve">AN02 # 15</w:t>
-      </w:r>
-    </w:p>
-    <w:p>
-      <w:pPr>
-        <w:numPr>
-          <w:ilvl w:val="0"/>
-          <w:numId w:val="29"/>
-        </w:numPr>
-        <w:rPr>
-          <w:sz w:val="20"/>
-          <w:szCs w:val="20"/>
-          <w:lang w:val="es-ES_tradnl"/>
-        </w:rPr>
-      </w:pPr>
-      <w:r>
-        <w:rPr>
-          <w:sz w:val="20"/>
-          <w:szCs w:val="20"/>
-          <w:lang w:val="es-ES_tradnl"/>
-        </w:rPr>
-        <w:t xml:space="preserve">El sistema retorna al paso 3 del flujo alterno FA02, para corregir.</w:t>
-      </w:r>
-    </w:p>
-    <w:p>
-      <w:pPr>
-        <w:numPr>
-          <w:ilvl w:val="0"/>
-          <w:numId w:val="29"/>
-        </w:numPr>
-        <w:rPr>
-          <w:sz w:val="20"/>
-          <w:szCs w:val="20"/>
-          <w:lang w:val="es-ES_tradnl"/>
-        </w:rPr>
-      </w:pPr>
-      <w:r>
-        <w:rPr>
-          <w:sz w:val="20"/>
-          <w:szCs w:val="20"/>
-          <w:lang w:val="es-ES_tradnl"/>
-        </w:rPr>
-        <w:t xml:space="preserve">Fin de flujo alterno.</w:t>
-      </w:r>
-    </w:p>
-    <w:p>
-      <w:pPr>
-        <w:rPr>
-          <w:sz w:val="20"/>
-          <w:szCs w:val="20"/>
-          <w:lang w:val="es-ES_tradnl"/>
-        </w:rPr>
-      </w:pPr>
-    </w:p>
-    <w:p>
-      <w:pPr>
+      </w:pPr>
+      <w:r>
         <w:rPr>
           <w:b/>
           <w:bCs/>
@@ -2632,7 +2918,50 @@
           <w:szCs w:val="20"/>
           <w:lang w:val="es-ES_tradnl"/>
         </w:rPr>
-      </w:pPr>
+        <w:t>FA08 Caso no encontrado</w:t>
+      </w:r>
+    </w:p>
+    <w:p>
+      <w:pPr>
+        <w:numPr>
+          <w:ilvl w:val="0"/>
+          <w:numId w:val="30"/>
+        </w:numPr>
+        <w:rPr>
+          <w:sz w:val="20"/>
+          <w:szCs w:val="20"/>
+          <w:lang w:val="es-ES_tradnl"/>
+        </w:rPr>
+      </w:pPr>
+      <w:r>
+        <w:rPr>
+          <w:sz w:val="20"/>
+          <w:szCs w:val="20"/>
+          <w:lang w:val="es-ES_tradnl"/>
+        </w:rPr>
+        <w:t>El sistema valida que exista un caso con el código ingresado.</w:t>
+      </w:r>
+    </w:p>
+    <w:p>
+      <w:pPr>
+        <w:numPr>
+          <w:ilvl w:val="0"/>
+          <w:numId w:val="30"/>
+        </w:numPr>
+        <w:rPr>
+          <w:sz w:val="20"/>
+          <w:szCs w:val="20"/>
+          <w:lang w:val="es-ES_tradnl"/>
+        </w:rPr>
+      </w:pPr>
+      <w:r>
+        <w:rPr>
+          <w:sz w:val="20"/>
+          <w:szCs w:val="20"/>
+          <w:lang w:val="es-ES_tradnl"/>
+        </w:rPr>
+        <w:t xml:space="preserve">El sistema muestra el mensaje de error. </w:t>
+      </w:r>
       <w:r>
         <w:rPr>
           <w:b/>
@@ -2641,7 +2970,7 @@
           <w:szCs w:val="20"/>
           <w:lang w:val="es-ES_tradnl"/>
         </w:rPr>
-        <w:t xml:space="preserve">FA08 Caso no encontrado</w:t>
+        <w:t>AN02 # 29</w:t>
       </w:r>
     </w:p>
     <w:p>
@@ -2662,7 +2991,35 @@
           <w:szCs w:val="20"/>
           <w:lang w:val="es-ES_tradnl"/>
         </w:rPr>
-        <w:t xml:space="preserve">El sistema valida que exista un caso con el código ingresado.</w:t>
+        <w:t xml:space="preserve">El sistema muestra el mensaje de error cuando el caso no pertenece al departamento del Supervisor o del </w:t>
+      </w:r>
+      <w:proofErr w:type="gramStart"/>
+      <w:r>
+        <w:rPr>
+          <w:sz w:val="20"/>
+          <w:szCs w:val="20"/>
+          <w:lang w:val="es-ES_tradnl"/>
+        </w:rPr>
+        <w:t>Jefe</w:t>
+      </w:r>
+      <w:proofErr w:type="gramEnd"/>
+      <w:r>
+        <w:rPr>
+          <w:sz w:val="20"/>
+          <w:szCs w:val="20"/>
+          <w:lang w:val="es-ES_tradnl"/>
+        </w:rPr>
+        <w:t xml:space="preserve"> de Departamento que lo consulta. </w:t>
+      </w:r>
+      <w:r>
+        <w:rPr>
+          <w:b/>
+          <w:bCs/>
+          <w:sz w:val="20"/>
+          <w:szCs w:val="20"/>
+          <w:lang w:val="es-ES_tradnl"/>
+        </w:rPr>
+        <w:t>AN02 # 45</w:t>
       </w:r>
     </w:p>
     <w:p>
@@ -2683,17 +3040,7 @@
           <w:szCs w:val="20"/>
           <w:lang w:val="es-ES_tradnl"/>
         </w:rPr>
-        <w:t xml:space="preserve">El sistema muestra el mensaje de error. </w:t>
-      </w:r>
-      <w:r>
-        <w:rPr>
-          <w:b/>
-          <w:bCs/>
-          <w:sz w:val="20"/>
-          <w:szCs w:val="20"/>
-          <w:lang w:val="es-ES_tradnl"/>
-        </w:rPr>
-        <w:t xml:space="preserve">AN02 # 29</w:t>
+        <w:t>El sistema retorna al paso 3 del flujo alterno FA02, para corregir.</w:t>
       </w:r>
     </w:p>
     <w:p>
@@ -2714,59 +3061,7 @@
           <w:szCs w:val="20"/>
           <w:lang w:val="es-ES_tradnl"/>
         </w:rPr>
-        <w:t xml:space="preserve">El sistema muestra el mensaje de error cuando el caso no pertenece al departamento del Supervisor o del Jefe de Departamento que lo consulta. </w:t>
-      </w:r>
-      <w:r>
-        <w:rPr>
-          <w:b/>
-          <w:bCs/>
-          <w:sz w:val="20"/>
-          <w:szCs w:val="20"/>
-          <w:lang w:val="es-ES_tradnl"/>
-        </w:rPr>
-        <w:t xml:space="preserve">AN02 # 45</w:t>
-      </w:r>
-    </w:p>
-    <w:p>
-      <w:pPr>
-        <w:numPr>
-          <w:ilvl w:val="0"/>
-          <w:numId w:val="30"/>
-        </w:numPr>
-        <w:rPr>
-          <w:sz w:val="20"/>
-          <w:szCs w:val="20"/>
-          <w:lang w:val="es-ES_tradnl"/>
-        </w:rPr>
-      </w:pPr>
-      <w:r>
-        <w:rPr>
-          <w:sz w:val="20"/>
-          <w:szCs w:val="20"/>
-          <w:lang w:val="es-ES_tradnl"/>
-        </w:rPr>
-        <w:t xml:space="preserve">El sistema retorna al paso 3 del flujo alterno FA02, para corregir.</w:t>
-      </w:r>
-    </w:p>
-    <w:p>
-      <w:pPr>
-        <w:numPr>
-          <w:ilvl w:val="0"/>
-          <w:numId w:val="30"/>
-        </w:numPr>
-        <w:rPr>
-          <w:sz w:val="20"/>
-          <w:szCs w:val="20"/>
-          <w:lang w:val="es-ES_tradnl"/>
-        </w:rPr>
-      </w:pPr>
-      <w:r>
-        <w:rPr>
-          <w:sz w:val="20"/>
-          <w:szCs w:val="20"/>
-          <w:lang w:val="es-ES_tradnl"/>
-        </w:rPr>
-        <w:t xml:space="preserve">Fin de flujo alterno.</w:t>
+        <w:t>Fin de flujo alterno.</w:t>
       </w:r>
     </w:p>
     <w:p>
@@ -2807,7 +3102,8 @@
           <w:sz w:val="20"/>
           <w:szCs w:val="20"/>
         </w:rPr>
-        <w:t xml:space="preserve">El reporte estadístico queda generado y disponible para su análisis y para descargarse en Excel o en PDF.</w:t>
+        <w:lastRenderedPageBreak/>
+        <w:t>El reporte estadístico queda generado y disponible para su análisis y para descargarse en Excel o en PDF.</w:t>
       </w:r>
     </w:p>
     <w:p>
@@ -2826,7 +3122,7 @@
           <w:sz w:val="20"/>
           <w:szCs w:val="20"/>
         </w:rPr>
-        <w:t xml:space="preserve">El reporte de trazabilidad del caso queda generado, sin modificar ningún dato del caso.</w:t>
+        <w:t>El reporte de trazabilidad del caso queda generado, sin modificar ningún dato del caso.</w:t>
       </w:r>
     </w:p>
     <w:p>
@@ -2845,7 +3141,23 @@
           <w:sz w:val="20"/>
           <w:szCs w:val="20"/>
         </w:rPr>
-        <w:t xml:space="preserve">El Supervisor y el Jefe de Departamento únicamente obtienen información de su propio departamento.</w:t>
+        <w:t xml:space="preserve">El Supervisor y el </w:t>
+      </w:r>
+      <w:proofErr w:type="gramStart"/>
+      <w:r>
+        <w:rPr>
+          <w:sz w:val="20"/>
+          <w:szCs w:val="20"/>
+        </w:rPr>
+        <w:t>Jefe</w:t>
+      </w:r>
+      <w:proofErr w:type="gramEnd"/>
+      <w:r>
+        <w:rPr>
+          <w:sz w:val="20"/>
+          <w:szCs w:val="20"/>
+        </w:rPr>
+        <w:t xml:space="preserve"> de Departamento únicamente obtienen información de su propio departamento.</w:t>
       </w:r>
     </w:p>
     <w:p>
@@ -2902,7 +3214,7 @@
           <w:sz w:val="20"/>
           <w:szCs w:val="20"/>
         </w:rPr>
-        <w:t xml:space="preserve">Los reportes deberán poder descargarse en formato PDF y en formato Excel.</w:t>
+        <w:t>Los reportes deberán poder descargarse en formato PDF y en formato Excel.</w:t>
       </w:r>
     </w:p>
     <w:p>
@@ -2921,7 +3233,23 @@
           <w:sz w:val="20"/>
           <w:szCs w:val="20"/>
         </w:rPr>
-        <w:t xml:space="preserve">La reportería deberá estar restringida a los roles de Supervisor, Jefe de Departamento y Administrador.</w:t>
+        <w:t xml:space="preserve">La reportería deberá estar restringida a los roles de Supervisor, </w:t>
+      </w:r>
+      <w:proofErr w:type="gramStart"/>
+      <w:r>
+        <w:rPr>
+          <w:sz w:val="20"/>
+          <w:szCs w:val="20"/>
+        </w:rPr>
+        <w:t>Jefe</w:t>
+      </w:r>
+      <w:proofErr w:type="gramEnd"/>
+      <w:r>
+        <w:rPr>
+          <w:sz w:val="20"/>
+          <w:szCs w:val="20"/>
+        </w:rPr>
+        <w:t xml:space="preserve"> de Departamento y Administrador.</w:t>
       </w:r>
     </w:p>
     <w:p>
@@ -2940,7 +3268,7 @@
           <w:sz w:val="20"/>
           <w:szCs w:val="20"/>
         </w:rPr>
-        <w:t xml:space="preserve">La generación de los reportes no deberá modificar ningún dato de los casos consultados.</w:t>
+        <w:t>La generación de los reportes no deberá modificar ningún dato de los casos consultados.</w:t>
       </w:r>
     </w:p>
     <w:p>
@@ -3896,7 +4224,7 @@
         <w:ind w:left="720" w:hanging="360"/>
       </w:pPr>
     </w:lvl>
-    <w:lvl w:ilvl="1" w:tplc="100A0019" w:tentative="1">
+    <w:lvl w:ilvl="1" w:tplc="100A0019">
       <w:start w:val="1"/>
       <w:numFmt w:val="lowerLetter"/>
       <w:lvlText w:val="%2."/>
@@ -4056,6 +4384,92 @@
     </w:lvl>
   </w:abstractNum>
   <w:abstractNum w:abstractNumId="8" w15:restartNumberingAfterBreak="0">
+    <w:nsid w:val="1B569965"/>
+    <w:multiLevelType w:val="hybridMultilevel"/>
+    <w:tmpl w:val="05863FEC"/>
+    <w:lvl w:ilvl="0" w:tplc="100A000F">
+      <w:start w:val="1"/>
+      <w:numFmt w:val="decimal"/>
+      <w:lvlText w:val="%1."/>
+      <w:lvlJc w:val="left"/>
+      <w:pPr>
+        <w:ind w:left="720" w:hanging="360"/>
+      </w:pPr>
+    </w:lvl>
+    <w:lvl w:ilvl="1" w:tplc="100A0019" w:tentative="1">
+      <w:start w:val="1"/>
+      <w:numFmt w:val="lowerLetter"/>
+      <w:lvlText w:val="%2."/>
+      <w:lvlJc w:val="left"/>
+      <w:pPr>
+        <w:ind w:left="1440" w:hanging="360"/>
+      </w:pPr>
+    </w:lvl>
+    <w:lvl w:ilvl="2" w:tplc="100A001B" w:tentative="1">
+      <w:start w:val="1"/>
+      <w:numFmt w:val="lowerRoman"/>
+      <w:lvlText w:val="%3."/>
+      <w:lvlJc w:val="right"/>
+      <w:pPr>
+        <w:ind w:left="2160" w:hanging="180"/>
+      </w:pPr>
+    </w:lvl>
+    <w:lvl w:ilvl="3" w:tplc="100A000F" w:tentative="1">
+      <w:start w:val="1"/>
+      <w:numFmt w:val="decimal"/>
+      <w:lvlText w:val="%4."/>
+      <w:lvlJc w:val="left"/>
+      <w:pPr>
+        <w:ind w:left="2880" w:hanging="360"/>
+      </w:pPr>
+    </w:lvl>
+    <w:lvl w:ilvl="4" w:tplc="100A0019" w:tentative="1">
+      <w:start w:val="1"/>
+      <w:numFmt w:val="lowerLetter"/>
+      <w:lvlText w:val="%5."/>
+      <w:lvlJc w:val="left"/>
+      <w:pPr>
+        <w:ind w:left="3600" w:hanging="360"/>
+      </w:pPr>
+    </w:lvl>
+    <w:lvl w:ilvl="5" w:tplc="100A001B" w:tentative="1">
+      <w:start w:val="1"/>
+      <w:numFmt w:val="lowerRoman"/>
+      <w:lvlText w:val="%6."/>
+      <w:lvlJc w:val="right"/>
+      <w:pPr>
+        <w:ind w:left="4320" w:hanging="180"/>
+      </w:pPr>
+    </w:lvl>
+    <w:lvl w:ilvl="6" w:tplc="100A000F" w:tentative="1">
+      <w:start w:val="1"/>
+      <w:numFmt w:val="decimal"/>
+      <w:lvlText w:val="%7."/>
+      <w:lvlJc w:val="left"/>
+      <w:pPr>
+        <w:ind w:left="5040" w:hanging="360"/>
+      </w:pPr>
+    </w:lvl>
+    <w:lvl w:ilvl="7" w:tplc="100A0019" w:tentative="1">
+      <w:start w:val="1"/>
+      <w:numFmt w:val="lowerLetter"/>
+      <w:lvlText w:val="%8."/>
+      <w:lvlJc w:val="left"/>
+      <w:pPr>
+        <w:ind w:left="5760" w:hanging="360"/>
+      </w:pPr>
+    </w:lvl>
+    <w:lvl w:ilvl="8" w:tplc="100A001B" w:tentative="1">
+      <w:start w:val="1"/>
+      <w:numFmt w:val="lowerRoman"/>
+      <w:lvlText w:val="%9."/>
+      <w:lvlJc w:val="right"/>
+      <w:pPr>
+        <w:ind w:left="6480" w:hanging="180"/>
+      </w:pPr>
+    </w:lvl>
+  </w:abstractNum>
+  <w:abstractNum w:abstractNumId="9" w15:restartNumberingAfterBreak="0">
     <w:nsid w:val="1F390D10"/>
     <w:multiLevelType w:val="singleLevel"/>
     <w:tmpl w:val="4D90F492"/>
@@ -4070,7 +4484,7 @@
       </w:pPr>
     </w:lvl>
   </w:abstractNum>
-  <w:abstractNum w:abstractNumId="9" w15:restartNumberingAfterBreak="0">
+  <w:abstractNum w:abstractNumId="10" w15:restartNumberingAfterBreak="0">
     <w:nsid w:val="2EAD69B2"/>
     <w:multiLevelType w:val="singleLevel"/>
     <w:tmpl w:val="4D90F492"/>
@@ -4085,7 +4499,7 @@
       </w:pPr>
     </w:lvl>
   </w:abstractNum>
-  <w:abstractNum w:abstractNumId="10" w15:restartNumberingAfterBreak="0">
+  <w:abstractNum w:abstractNumId="11" w15:restartNumberingAfterBreak="0">
     <w:nsid w:val="3A0A5BE7"/>
     <w:multiLevelType w:val="hybridMultilevel"/>
     <w:tmpl w:val="0AA0074A"/>
@@ -4174,7 +4588,7 @@
       </w:pPr>
     </w:lvl>
   </w:abstractNum>
-  <w:abstractNum w:abstractNumId="11" w15:restartNumberingAfterBreak="0">
+  <w:abstractNum w:abstractNumId="12" w15:restartNumberingAfterBreak="0">
     <w:nsid w:val="3D216DD9"/>
     <w:multiLevelType w:val="hybridMultilevel"/>
     <w:tmpl w:val="61B6E42C"/>
@@ -4263,7 +4677,7 @@
       </w:pPr>
     </w:lvl>
   </w:abstractNum>
-  <w:abstractNum w:abstractNumId="12" w15:restartNumberingAfterBreak="0">
+  <w:abstractNum w:abstractNumId="13" w15:restartNumberingAfterBreak="0">
     <w:nsid w:val="3D441E1C"/>
     <w:multiLevelType w:val="multilevel"/>
     <w:tmpl w:val="0409001F"/>
@@ -4352,7 +4766,93 @@
       </w:pPr>
     </w:lvl>
   </w:abstractNum>
-  <w:abstractNum w:abstractNumId="13" w15:restartNumberingAfterBreak="0">
+  <w:abstractNum w:abstractNumId="14" w15:restartNumberingAfterBreak="0">
+    <w:nsid w:val="3E80026D"/>
+    <w:multiLevelType w:val="hybridMultilevel"/>
+    <w:tmpl w:val="05863FEC"/>
+    <w:lvl w:ilvl="0" w:tplc="100A000F">
+      <w:start w:val="1"/>
+      <w:numFmt w:val="decimal"/>
+      <w:lvlText w:val="%1."/>
+      <w:lvlJc w:val="left"/>
+      <w:pPr>
+        <w:ind w:left="720" w:hanging="360"/>
+      </w:pPr>
+    </w:lvl>
+    <w:lvl w:ilvl="1" w:tplc="100A0019" w:tentative="1">
+      <w:start w:val="1"/>
+      <w:numFmt w:val="lowerLetter"/>
+      <w:lvlText w:val="%2."/>
+      <w:lvlJc w:val="left"/>
+      <w:pPr>
+        <w:ind w:left="1440" w:hanging="360"/>
+      </w:pPr>
+    </w:lvl>
+    <w:lvl w:ilvl="2" w:tplc="100A001B" w:tentative="1">
+      <w:start w:val="1"/>
+      <w:numFmt w:val="lowerRoman"/>
+      <w:lvlText w:val="%3."/>
+      <w:lvlJc w:val="right"/>
+      <w:pPr>
+        <w:ind w:left="2160" w:hanging="180"/>
+      </w:pPr>
+    </w:lvl>
+    <w:lvl w:ilvl="3" w:tplc="100A000F" w:tentative="1">
+      <w:start w:val="1"/>
+      <w:numFmt w:val="decimal"/>
+      <w:lvlText w:val="%4."/>
+      <w:lvlJc w:val="left"/>
+      <w:pPr>
+        <w:ind w:left="2880" w:hanging="360"/>
+      </w:pPr>
+    </w:lvl>
+    <w:lvl w:ilvl="4" w:tplc="100A0019" w:tentative="1">
+      <w:start w:val="1"/>
+      <w:numFmt w:val="lowerLetter"/>
+      <w:lvlText w:val="%5."/>
+      <w:lvlJc w:val="left"/>
+      <w:pPr>
+        <w:ind w:left="3600" w:hanging="360"/>
+      </w:pPr>
+    </w:lvl>
+    <w:lvl w:ilvl="5" w:tplc="100A001B" w:tentative="1">
+      <w:start w:val="1"/>
+      <w:numFmt w:val="lowerRoman"/>
+      <w:lvlText w:val="%6."/>
+      <w:lvlJc w:val="right"/>
+      <w:pPr>
+        <w:ind w:left="4320" w:hanging="180"/>
+      </w:pPr>
+    </w:lvl>
+    <w:lvl w:ilvl="6" w:tplc="100A000F" w:tentative="1">
+      <w:start w:val="1"/>
+      <w:numFmt w:val="decimal"/>
+      <w:lvlText w:val="%7."/>
+      <w:lvlJc w:val="left"/>
+      <w:pPr>
+        <w:ind w:left="5040" w:hanging="360"/>
+      </w:pPr>
+    </w:lvl>
+    <w:lvl w:ilvl="7" w:tplc="100A0019" w:tentative="1">
+      <w:start w:val="1"/>
+      <w:numFmt w:val="lowerLetter"/>
+      <w:lvlText w:val="%8."/>
+      <w:lvlJc w:val="left"/>
+      <w:pPr>
+        <w:ind w:left="5760" w:hanging="360"/>
+      </w:pPr>
+    </w:lvl>
+    <w:lvl w:ilvl="8" w:tplc="100A001B" w:tentative="1">
+      <w:start w:val="1"/>
+      <w:numFmt w:val="lowerRoman"/>
+      <w:lvlText w:val="%9."/>
+      <w:lvlJc w:val="right"/>
+      <w:pPr>
+        <w:ind w:left="6480" w:hanging="180"/>
+      </w:pPr>
+    </w:lvl>
+  </w:abstractNum>
+  <w:abstractNum w:abstractNumId="15" w15:restartNumberingAfterBreak="0">
     <w:nsid w:val="433C1667"/>
     <w:multiLevelType w:val="hybridMultilevel"/>
     <w:tmpl w:val="29CCE532"/>
@@ -4438,7 +4938,7 @@
       </w:pPr>
     </w:lvl>
   </w:abstractNum>
-  <w:abstractNum w:abstractNumId="14" w15:restartNumberingAfterBreak="0">
+  <w:abstractNum w:abstractNumId="16" w15:restartNumberingAfterBreak="0">
     <w:nsid w:val="468E7701"/>
     <w:multiLevelType w:val="multilevel"/>
     <w:tmpl w:val="85A0DEC6"/>
@@ -4587,7 +5087,7 @@
       </w:rPr>
     </w:lvl>
   </w:abstractNum>
-  <w:abstractNum w:abstractNumId="15" w15:restartNumberingAfterBreak="0">
+  <w:abstractNum w:abstractNumId="17" w15:restartNumberingAfterBreak="0">
     <w:nsid w:val="47571CF2"/>
     <w:multiLevelType w:val="hybridMultilevel"/>
     <w:tmpl w:val="FEBADBA0"/>
@@ -4673,7 +5173,7 @@
       </w:pPr>
     </w:lvl>
   </w:abstractNum>
-  <w:abstractNum w:abstractNumId="16" w15:restartNumberingAfterBreak="0">
+  <w:abstractNum w:abstractNumId="18" w15:restartNumberingAfterBreak="0">
     <w:nsid w:val="47609A08"/>
     <w:multiLevelType w:val="hybridMultilevel"/>
     <w:tmpl w:val="05863FEC"/>
@@ -4759,7 +5259,7 @@
       </w:pPr>
     </w:lvl>
   </w:abstractNum>
-  <w:abstractNum w:abstractNumId="17" w15:restartNumberingAfterBreak="0">
+  <w:abstractNum w:abstractNumId="19" w15:restartNumberingAfterBreak="0">
     <w:nsid w:val="4E5005E9"/>
     <w:multiLevelType w:val="hybridMultilevel"/>
     <w:tmpl w:val="97AAC656"/>
@@ -4848,7 +5348,7 @@
       </w:pPr>
     </w:lvl>
   </w:abstractNum>
-  <w:abstractNum w:abstractNumId="18" w15:restartNumberingAfterBreak="0">
+  <w:abstractNum w:abstractNumId="20" w15:restartNumberingAfterBreak="0">
     <w:nsid w:val="517E14EA"/>
     <w:multiLevelType w:val="hybridMultilevel"/>
     <w:tmpl w:val="05863FEC"/>
@@ -4934,7 +5434,7 @@
       </w:pPr>
     </w:lvl>
   </w:abstractNum>
-  <w:abstractNum w:abstractNumId="19" w15:restartNumberingAfterBreak="0">
+  <w:abstractNum w:abstractNumId="21" w15:restartNumberingAfterBreak="0">
     <w:nsid w:val="53A61698"/>
     <w:multiLevelType w:val="hybridMultilevel"/>
     <w:tmpl w:val="05863FEC"/>
@@ -5020,7 +5520,7 @@
       </w:pPr>
     </w:lvl>
   </w:abstractNum>
-  <w:abstractNum w:abstractNumId="20" w15:restartNumberingAfterBreak="0">
+  <w:abstractNum w:abstractNumId="22" w15:restartNumberingAfterBreak="0">
     <w:nsid w:val="5C8A5CBA"/>
     <w:multiLevelType w:val="hybridMultilevel"/>
     <w:tmpl w:val="05863FEC"/>
@@ -5106,7 +5606,97 @@
       </w:pPr>
     </w:lvl>
   </w:abstractNum>
-  <w:abstractNum w:abstractNumId="21" w15:restartNumberingAfterBreak="0">
+  <w:abstractNum w:abstractNumId="23" w15:restartNumberingAfterBreak="0">
+    <w:nsid w:val="650127D9"/>
+    <w:multiLevelType w:val="hybridMultilevel"/>
+    <w:tmpl w:val="F762329C"/>
+    <w:lvl w:ilvl="0" w:tplc="580A0017">
+      <w:start w:val="1"/>
+      <w:numFmt w:val="lowerLetter"/>
+      <w:lvlText w:val="%1)"/>
+      <w:lvlJc w:val="left"/>
+      <w:pPr>
+        <w:ind w:left="1080" w:hanging="360"/>
+      </w:pPr>
+      <w:rPr>
+        <w:rFonts w:hint="default"/>
+        <w:b/>
+      </w:rPr>
+    </w:lvl>
+    <w:lvl w:ilvl="1" w:tplc="580A0019" w:tentative="1">
+      <w:start w:val="1"/>
+      <w:numFmt w:val="lowerLetter"/>
+      <w:lvlText w:val="%2."/>
+      <w:lvlJc w:val="left"/>
+      <w:pPr>
+        <w:ind w:left="1800" w:hanging="360"/>
+      </w:pPr>
+    </w:lvl>
+    <w:lvl w:ilvl="2" w:tplc="580A001B" w:tentative="1">
+      <w:start w:val="1"/>
+      <w:numFmt w:val="lowerRoman"/>
+      <w:lvlText w:val="%3."/>
+      <w:lvlJc w:val="right"/>
+      <w:pPr>
+        <w:ind w:left="2520" w:hanging="180"/>
+      </w:pPr>
+    </w:lvl>
+    <w:lvl w:ilvl="3" w:tplc="580A000F" w:tentative="1">
+      <w:start w:val="1"/>
+      <w:numFmt w:val="decimal"/>
+      <w:lvlText w:val="%4."/>
+      <w:lvlJc w:val="left"/>
+      <w:pPr>
+        <w:ind w:left="3240" w:hanging="360"/>
+      </w:pPr>
+    </w:lvl>
+    <w:lvl w:ilvl="4" w:tplc="580A0019" w:tentative="1">
+      <w:start w:val="1"/>
+      <w:numFmt w:val="lowerLetter"/>
+      <w:lvlText w:val="%5."/>
+      <w:lvlJc w:val="left"/>
+      <w:pPr>
+        <w:ind w:left="3960" w:hanging="360"/>
+      </w:pPr>
+    </w:lvl>
+    <w:lvl w:ilvl="5" w:tplc="580A001B" w:tentative="1">
+      <w:start w:val="1"/>
+      <w:numFmt w:val="lowerRoman"/>
+      <w:lvlText w:val="%6."/>
+      <w:lvlJc w:val="right"/>
+      <w:pPr>
+        <w:ind w:left="4680" w:hanging="180"/>
+      </w:pPr>
+    </w:lvl>
+    <w:lvl w:ilvl="6" w:tplc="580A000F" w:tentative="1">
+      <w:start w:val="1"/>
+      <w:numFmt w:val="decimal"/>
+      <w:lvlText w:val="%7."/>
+      <w:lvlJc w:val="left"/>
+      <w:pPr>
+        <w:ind w:left="5400" w:hanging="360"/>
+      </w:pPr>
+    </w:lvl>
+    <w:lvl w:ilvl="7" w:tplc="580A0019" w:tentative="1">
+      <w:start w:val="1"/>
+      <w:numFmt w:val="lowerLetter"/>
+      <w:lvlText w:val="%8."/>
+      <w:lvlJc w:val="left"/>
+      <w:pPr>
+        <w:ind w:left="6120" w:hanging="360"/>
+      </w:pPr>
+    </w:lvl>
+    <w:lvl w:ilvl="8" w:tplc="580A001B" w:tentative="1">
+      <w:start w:val="1"/>
+      <w:numFmt w:val="lowerRoman"/>
+      <w:lvlText w:val="%9."/>
+      <w:lvlJc w:val="right"/>
+      <w:pPr>
+        <w:ind w:left="6840" w:hanging="180"/>
+      </w:pPr>
+    </w:lvl>
+  </w:abstractNum>
+  <w:abstractNum w:abstractNumId="24" w15:restartNumberingAfterBreak="0">
     <w:nsid w:val="70926623"/>
     <w:multiLevelType w:val="hybridMultilevel"/>
     <w:tmpl w:val="59F69580"/>
@@ -5195,7 +5785,7 @@
       </w:pPr>
     </w:lvl>
   </w:abstractNum>
-  <w:abstractNum w:abstractNumId="22" w15:restartNumberingAfterBreak="0">
+  <w:abstractNum w:abstractNumId="25" w15:restartNumberingAfterBreak="0">
     <w:nsid w:val="73112FDD"/>
     <w:multiLevelType w:val="hybridMultilevel"/>
     <w:tmpl w:val="FEBADBA0"/>
@@ -5281,7 +5871,97 @@
       </w:pPr>
     </w:lvl>
   </w:abstractNum>
-  <w:abstractNum w:abstractNumId="23" w15:restartNumberingAfterBreak="0">
+  <w:abstractNum w:abstractNumId="26" w15:restartNumberingAfterBreak="0">
+    <w:nsid w:val="757314E4"/>
+    <w:multiLevelType w:val="hybridMultilevel"/>
+    <w:tmpl w:val="33E67980"/>
+    <w:lvl w:ilvl="0" w:tplc="3C169E38">
+      <w:start w:val="1"/>
+      <w:numFmt w:val="upperLetter"/>
+      <w:lvlText w:val="%1)"/>
+      <w:lvlJc w:val="left"/>
+      <w:pPr>
+        <w:ind w:left="1080" w:hanging="360"/>
+      </w:pPr>
+      <w:rPr>
+        <w:rFonts w:hint="default"/>
+        <w:b/>
+      </w:rPr>
+    </w:lvl>
+    <w:lvl w:ilvl="1" w:tplc="580A0019" w:tentative="1">
+      <w:start w:val="1"/>
+      <w:numFmt w:val="lowerLetter"/>
+      <w:lvlText w:val="%2."/>
+      <w:lvlJc w:val="left"/>
+      <w:pPr>
+        <w:ind w:left="1800" w:hanging="360"/>
+      </w:pPr>
+    </w:lvl>
+    <w:lvl w:ilvl="2" w:tplc="580A001B" w:tentative="1">
+      <w:start w:val="1"/>
+      <w:numFmt w:val="lowerRoman"/>
+      <w:lvlText w:val="%3."/>
+      <w:lvlJc w:val="right"/>
+      <w:pPr>
+        <w:ind w:left="2520" w:hanging="180"/>
+      </w:pPr>
+    </w:lvl>
+    <w:lvl w:ilvl="3" w:tplc="580A000F" w:tentative="1">
+      <w:start w:val="1"/>
+      <w:numFmt w:val="decimal"/>
+      <w:lvlText w:val="%4."/>
+      <w:lvlJc w:val="left"/>
+      <w:pPr>
+        <w:ind w:left="3240" w:hanging="360"/>
+      </w:pPr>
+    </w:lvl>
+    <w:lvl w:ilvl="4" w:tplc="580A0019" w:tentative="1">
+      <w:start w:val="1"/>
+      <w:numFmt w:val="lowerLetter"/>
+      <w:lvlText w:val="%5."/>
+      <w:lvlJc w:val="left"/>
+      <w:pPr>
+        <w:ind w:left="3960" w:hanging="360"/>
+      </w:pPr>
+    </w:lvl>
+    <w:lvl w:ilvl="5" w:tplc="580A001B" w:tentative="1">
+      <w:start w:val="1"/>
+      <w:numFmt w:val="lowerRoman"/>
+      <w:lvlText w:val="%6."/>
+      <w:lvlJc w:val="right"/>
+      <w:pPr>
+        <w:ind w:left="4680" w:hanging="180"/>
+      </w:pPr>
+    </w:lvl>
+    <w:lvl w:ilvl="6" w:tplc="580A000F" w:tentative="1">
+      <w:start w:val="1"/>
+      <w:numFmt w:val="decimal"/>
+      <w:lvlText w:val="%7."/>
+      <w:lvlJc w:val="left"/>
+      <w:pPr>
+        <w:ind w:left="5400" w:hanging="360"/>
+      </w:pPr>
+    </w:lvl>
+    <w:lvl w:ilvl="7" w:tplc="580A0019" w:tentative="1">
+      <w:start w:val="1"/>
+      <w:numFmt w:val="lowerLetter"/>
+      <w:lvlText w:val="%8."/>
+      <w:lvlJc w:val="left"/>
+      <w:pPr>
+        <w:ind w:left="6120" w:hanging="360"/>
+      </w:pPr>
+    </w:lvl>
+    <w:lvl w:ilvl="8" w:tplc="580A001B" w:tentative="1">
+      <w:start w:val="1"/>
+      <w:numFmt w:val="lowerRoman"/>
+      <w:lvlText w:val="%9."/>
+      <w:lvlJc w:val="right"/>
+      <w:pPr>
+        <w:ind w:left="6840" w:hanging="180"/>
+      </w:pPr>
+    </w:lvl>
+  </w:abstractNum>
+  <w:abstractNum w:abstractNumId="27" w15:restartNumberingAfterBreak="0">
     <w:nsid w:val="757B3DE1"/>
     <w:multiLevelType w:val="hybridMultilevel"/>
     <w:tmpl w:val="97AAC656"/>
@@ -5370,7 +6050,7 @@
       </w:pPr>
     </w:lvl>
   </w:abstractNum>
-  <w:abstractNum w:abstractNumId="24" w15:restartNumberingAfterBreak="0">
+  <w:abstractNum w:abstractNumId="28" w15:restartNumberingAfterBreak="0">
     <w:nsid w:val="776B915A"/>
     <w:multiLevelType w:val="hybridMultilevel"/>
     <w:tmpl w:val="05863FEC"/>
@@ -5456,7 +6136,7 @@
       </w:pPr>
     </w:lvl>
   </w:abstractNum>
-  <w:abstractNum w:abstractNumId="25" w15:restartNumberingAfterBreak="0">
+  <w:abstractNum w:abstractNumId="29" w15:restartNumberingAfterBreak="0">
     <w:nsid w:val="77F5392A"/>
     <w:multiLevelType w:val="hybridMultilevel"/>
     <w:tmpl w:val="6E72A7EA"/>
@@ -5545,7 +6225,7 @@
       </w:pPr>
     </w:lvl>
   </w:abstractNum>
-  <w:abstractNum w:abstractNumId="26" w15:restartNumberingAfterBreak="0">
+  <w:abstractNum w:abstractNumId="30" w15:restartNumberingAfterBreak="0">
     <w:nsid w:val="7A492679"/>
     <w:multiLevelType w:val="hybridMultilevel"/>
     <w:tmpl w:val="45E6E7B8"/>
@@ -5634,7 +6314,7 @@
       </w:pPr>
     </w:lvl>
   </w:abstractNum>
-  <w:abstractNum w:abstractNumId="27" w15:restartNumberingAfterBreak="0">
+  <w:abstractNum w:abstractNumId="31" w15:restartNumberingAfterBreak="0">
     <w:nsid w:val="7EA42152"/>
     <w:multiLevelType w:val="multilevel"/>
     <w:tmpl w:val="100A001F"/>
@@ -5720,180 +6400,8 @@
       </w:pPr>
     </w:lvl>
   </w:abstractNum>
-  <w:abstractNum w:abstractNumId="28" w15:restartNumberingAfterBreak="0">
-    <w:nsid w:val="3E80026D"/>
-    <w:multiLevelType w:val="hybridMultilevel"/>
-    <w:tmpl w:val="05863FEC"/>
-    <w:lvl w:ilvl="0" w:tplc="100A000F">
-      <w:start w:val="1"/>
-      <w:numFmt w:val="decimal"/>
-      <w:lvlText w:val="%1."/>
-      <w:lvlJc w:val="left"/>
-      <w:pPr>
-        <w:ind w:left="720" w:hanging="360"/>
-      </w:pPr>
-    </w:lvl>
-    <w:lvl w:ilvl="1" w:tplc="100A0019" w:tentative="1">
-      <w:start w:val="1"/>
-      <w:numFmt w:val="lowerLetter"/>
-      <w:lvlText w:val="%2."/>
-      <w:lvlJc w:val="left"/>
-      <w:pPr>
-        <w:ind w:left="1440" w:hanging="360"/>
-      </w:pPr>
-    </w:lvl>
-    <w:lvl w:ilvl="2" w:tplc="100A001B" w:tentative="1">
-      <w:start w:val="1"/>
-      <w:numFmt w:val="lowerRoman"/>
-      <w:lvlText w:val="%3."/>
-      <w:lvlJc w:val="right"/>
-      <w:pPr>
-        <w:ind w:left="2160" w:hanging="180"/>
-      </w:pPr>
-    </w:lvl>
-    <w:lvl w:ilvl="3" w:tplc="100A000F" w:tentative="1">
-      <w:start w:val="1"/>
-      <w:numFmt w:val="decimal"/>
-      <w:lvlText w:val="%4."/>
-      <w:lvlJc w:val="left"/>
-      <w:pPr>
-        <w:ind w:left="2880" w:hanging="360"/>
-      </w:pPr>
-    </w:lvl>
-    <w:lvl w:ilvl="4" w:tplc="100A0019" w:tentative="1">
-      <w:start w:val="1"/>
-      <w:numFmt w:val="lowerLetter"/>
-      <w:lvlText w:val="%5."/>
-      <w:lvlJc w:val="left"/>
-      <w:pPr>
-        <w:ind w:left="3600" w:hanging="360"/>
-      </w:pPr>
-    </w:lvl>
-    <w:lvl w:ilvl="5" w:tplc="100A001B" w:tentative="1">
-      <w:start w:val="1"/>
-      <w:numFmt w:val="lowerRoman"/>
-      <w:lvlText w:val="%6."/>
-      <w:lvlJc w:val="right"/>
-      <w:pPr>
-        <w:ind w:left="4320" w:hanging="180"/>
-      </w:pPr>
-    </w:lvl>
-    <w:lvl w:ilvl="6" w:tplc="100A000F" w:tentative="1">
-      <w:start w:val="1"/>
-      <w:numFmt w:val="decimal"/>
-      <w:lvlText w:val="%7."/>
-      <w:lvlJc w:val="left"/>
-      <w:pPr>
-        <w:ind w:left="5040" w:hanging="360"/>
-      </w:pPr>
-    </w:lvl>
-    <w:lvl w:ilvl="7" w:tplc="100A0019" w:tentative="1">
-      <w:start w:val="1"/>
-      <w:numFmt w:val="lowerLetter"/>
-      <w:lvlText w:val="%8."/>
-      <w:lvlJc w:val="left"/>
-      <w:pPr>
-        <w:ind w:left="5760" w:hanging="360"/>
-      </w:pPr>
-    </w:lvl>
-    <w:lvl w:ilvl="8" w:tplc="100A001B" w:tentative="1">
-      <w:start w:val="1"/>
-      <w:numFmt w:val="lowerRoman"/>
-      <w:lvlText w:val="%9."/>
-      <w:lvlJc w:val="right"/>
-      <w:pPr>
-        <w:ind w:left="6480" w:hanging="180"/>
-      </w:pPr>
-    </w:lvl>
-  </w:abstractNum>
-  <w:abstractNum w:abstractNumId="29" w15:restartNumberingAfterBreak="0">
-    <w:nsid w:val="1B569965"/>
-    <w:multiLevelType w:val="hybridMultilevel"/>
-    <w:tmpl w:val="05863FEC"/>
-    <w:lvl w:ilvl="0" w:tplc="100A000F">
-      <w:start w:val="1"/>
-      <w:numFmt w:val="decimal"/>
-      <w:lvlText w:val="%1."/>
-      <w:lvlJc w:val="left"/>
-      <w:pPr>
-        <w:ind w:left="720" w:hanging="360"/>
-      </w:pPr>
-    </w:lvl>
-    <w:lvl w:ilvl="1" w:tplc="100A0019" w:tentative="1">
-      <w:start w:val="1"/>
-      <w:numFmt w:val="lowerLetter"/>
-      <w:lvlText w:val="%2."/>
-      <w:lvlJc w:val="left"/>
-      <w:pPr>
-        <w:ind w:left="1440" w:hanging="360"/>
-      </w:pPr>
-    </w:lvl>
-    <w:lvl w:ilvl="2" w:tplc="100A001B" w:tentative="1">
-      <w:start w:val="1"/>
-      <w:numFmt w:val="lowerRoman"/>
-      <w:lvlText w:val="%3."/>
-      <w:lvlJc w:val="right"/>
-      <w:pPr>
-        <w:ind w:left="2160" w:hanging="180"/>
-      </w:pPr>
-    </w:lvl>
-    <w:lvl w:ilvl="3" w:tplc="100A000F" w:tentative="1">
-      <w:start w:val="1"/>
-      <w:numFmt w:val="decimal"/>
-      <w:lvlText w:val="%4."/>
-      <w:lvlJc w:val="left"/>
-      <w:pPr>
-        <w:ind w:left="2880" w:hanging="360"/>
-      </w:pPr>
-    </w:lvl>
-    <w:lvl w:ilvl="4" w:tplc="100A0019" w:tentative="1">
-      <w:start w:val="1"/>
-      <w:numFmt w:val="lowerLetter"/>
-      <w:lvlText w:val="%5."/>
-      <w:lvlJc w:val="left"/>
-      <w:pPr>
-        <w:ind w:left="3600" w:hanging="360"/>
-      </w:pPr>
-    </w:lvl>
-    <w:lvl w:ilvl="5" w:tplc="100A001B" w:tentative="1">
-      <w:start w:val="1"/>
-      <w:numFmt w:val="lowerRoman"/>
-      <w:lvlText w:val="%6."/>
-      <w:lvlJc w:val="right"/>
-      <w:pPr>
-        <w:ind w:left="4320" w:hanging="180"/>
-      </w:pPr>
-    </w:lvl>
-    <w:lvl w:ilvl="6" w:tplc="100A000F" w:tentative="1">
-      <w:start w:val="1"/>
-      <w:numFmt w:val="decimal"/>
-      <w:lvlText w:val="%7."/>
-      <w:lvlJc w:val="left"/>
-      <w:pPr>
-        <w:ind w:left="5040" w:hanging="360"/>
-      </w:pPr>
-    </w:lvl>
-    <w:lvl w:ilvl="7" w:tplc="100A0019" w:tentative="1">
-      <w:start w:val="1"/>
-      <w:numFmt w:val="lowerLetter"/>
-      <w:lvlText w:val="%8."/>
-      <w:lvlJc w:val="left"/>
-      <w:pPr>
-        <w:ind w:left="5760" w:hanging="360"/>
-      </w:pPr>
-    </w:lvl>
-    <w:lvl w:ilvl="8" w:tplc="100A001B" w:tentative="1">
-      <w:start w:val="1"/>
-      <w:numFmt w:val="lowerRoman"/>
-      <w:lvlText w:val="%9."/>
-      <w:lvlJc w:val="right"/>
-      <w:pPr>
-        <w:ind w:left="6480" w:hanging="180"/>
-      </w:pPr>
-    </w:lvl>
-  </w:abstractNum>
   <w:num w:numId="1">
-    <w:abstractNumId w:val="14"/>
+    <w:abstractNumId w:val="16"/>
   </w:num>
   <w:num w:numId="2">
     <w:abstractNumId w:val="2"/>
@@ -5902,13 +6410,13 @@
     <w:abstractNumId w:val="0"/>
   </w:num>
   <w:num w:numId="4">
-    <w:abstractNumId w:val="12"/>
+    <w:abstractNumId w:val="13"/>
   </w:num>
   <w:num w:numId="5">
-    <w:abstractNumId w:val="9"/>
+    <w:abstractNumId w:val="10"/>
   </w:num>
   <w:num w:numId="6">
-    <w:abstractNumId w:val="8"/>
+    <w:abstractNumId w:val="9"/>
   </w:num>
   <w:num w:numId="7">
     <w:abstractNumId w:val="5"/>
@@ -5917,40 +6425,40 @@
     <w:abstractNumId w:val="7"/>
   </w:num>
   <w:num w:numId="9">
-    <w:abstractNumId w:val="10"/>
+    <w:abstractNumId w:val="11"/>
   </w:num>
   <w:num w:numId="10">
-    <w:abstractNumId w:val="26"/>
+    <w:abstractNumId w:val="30"/>
   </w:num>
   <w:num w:numId="11">
-    <w:abstractNumId w:val="17"/>
+    <w:abstractNumId w:val="19"/>
   </w:num>
   <w:num w:numId="12">
     <w:abstractNumId w:val="1"/>
   </w:num>
   <w:num w:numId="13">
-    <w:abstractNumId w:val="11"/>
+    <w:abstractNumId w:val="12"/>
   </w:num>
   <w:num w:numId="14">
-    <w:abstractNumId w:val="21"/>
+    <w:abstractNumId w:val="24"/>
   </w:num>
   <w:num w:numId="15">
-    <w:abstractNumId w:val="25"/>
+    <w:abstractNumId w:val="29"/>
   </w:num>
   <w:num w:numId="16">
-    <w:abstractNumId w:val="23"/>
+    <w:abstractNumId w:val="27"/>
   </w:num>
   <w:num w:numId="17">
-    <w:abstractNumId w:val="27"/>
+    <w:abstractNumId w:val="31"/>
   </w:num>
   <w:num w:numId="18">
     <w:abstractNumId w:val="4"/>
   </w:num>
   <w:num w:numId="19">
-    <w:abstractNumId w:val="13"/>
+    <w:abstractNumId w:val="15"/>
   </w:num>
   <w:num w:numId="20">
-    <w:abstractNumId w:val="20"/>
+    <w:abstractNumId w:val="22"/>
   </w:num>
   <w:num w:numId="21">
     <w:abstractNumId w:val="6"/>
@@ -5959,28 +6467,34 @@
     <w:abstractNumId w:val="3"/>
   </w:num>
   <w:num w:numId="23">
-    <w:abstractNumId w:val="22"/>
+    <w:abstractNumId w:val="25"/>
   </w:num>
   <w:num w:numId="24">
-    <w:abstractNumId w:val="15"/>
+    <w:abstractNumId w:val="17"/>
   </w:num>
   <w:num w:numId="25">
-    <w:abstractNumId w:val="24"/>
+    <w:abstractNumId w:val="28"/>
   </w:num>
   <w:num w:numId="26">
+    <w:abstractNumId w:val="20"/>
+  </w:num>
+  <w:num w:numId="27">
     <w:abstractNumId w:val="18"/>
   </w:num>
-  <w:num w:numId="27">
-    <w:abstractNumId w:val="16"/>
-  </w:num>
   <w:num w:numId="28">
-    <w:abstractNumId w:val="19"/>
+    <w:abstractNumId w:val="21"/>
   </w:num>
   <w:num w:numId="29">
-    <w:abstractNumId w:val="28"/>
+    <w:abstractNumId w:val="14"/>
   </w:num>
   <w:num w:numId="30">
-    <w:abstractNumId w:val="29"/>
+    <w:abstractNumId w:val="8"/>
+  </w:num>
+  <w:num w:numId="31">
+    <w:abstractNumId w:val="26"/>
+  </w:num>
+  <w:num w:numId="32">
+    <w:abstractNumId w:val="23"/>
   </w:num>
 </w:numbering>
 </file>

</xml_diff>